<commit_message>
Add native mathematical formulation to IEEE report
</commit_message>
<xml_diff>
--- a/dokumen/Laporan_RuteSiaga_IEEE_Final.docx
+++ b/dokumen/Laporan_RuteSiaga_IEEE_Final.docx
@@ -104,6 +104,20 @@
       </w:r>
     </w:p>
     <w:p>
+      <w:pPr>
+        <w:keepLines/>
+        <w:spacing w:before="60" w:after="100"/>
+        <w:jc w:val="center"/>
+      </w:pPr>
+      <m:oMathPara>
+        <m:oMath>
+          <m:r>
+            <m:t>G = (V, E),    R ⊆ V,    s = (v, eᵢₙ)</m:t>
+          </m:r>
+        </m:oMath>
+      </m:oMathPara>
+    </w:p>
+    <w:p>
       <w:r>
         <w:t>Kelas jalan dan atribut lebar dipakai sebagai proksi kelayakan ambulans. Jalan utama dapat masuk graf bila memenuhi aturan akses dan dimensi; jalan residential dan unclassified memerlukan lebar tercatat sedikitnya 3 m untuk masuk jaringan utama. Jalan layanan atau jalan lokal yang memenuhi aturan akses dapat dipakai pada sambungan awal, dengan radius pencarian maksimum 1 km. Proksi ini tidak membuktikan lebar atau kelayakan fisik setiap ruas.</w:t>
       </w:r>
@@ -123,13 +137,69 @@
     </w:p>
     <w:p>
       <w:r>
-        <w:t>Biaya tiap ruas merupakan penjumlahan waktu tempuh dasar dan penalti setempat, seluruhnya dalam detik. Waktu dasar diperoleh dengan membagi panjang ruas (meter) oleh kecepatan kelas jalan (meter per detik). Kecepatan dasar berada pada rentang 10–60 km/jam. Parameter pagi, siang, sore, dan malam merupakan asumsi penelitian, bukan data lalu lintas langsung.</w:t>
+        <w:t>Untuk ruas e pada skenario t, model memakai panjang L(e) dalam meter, kecepatan v(e) dalam km/jam, dan seluruh biaya dalam detik. Waktu dasar b(e) dan biaya total c(e,t) dirumuskan sebagai berikut.</w:t>
       </w:r>
     </w:p>
     <w:p>
+      <w:pPr>
+        <w:keepLines/>
+        <w:spacing w:before="60" w:after="100"/>
+        <w:jc w:val="center"/>
+      </w:pPr>
+      <m:oMathPara>
+        <m:oMath>
+          <m:r>
+            <m:t>b(e) = 3,6 L(e) / v(e)</m:t>
+          </m:r>
+        </m:oMath>
+      </m:oMathPara>
+    </w:p>
+    <w:p>
+      <w:pPr>
+        <w:keepLines/>
+        <w:spacing w:before="60" w:after="100"/>
+        <w:jc w:val="center"/>
+      </w:pPr>
+      <m:oMathPara>
+        <m:oMath>
+          <m:r>
+            <m:t>c(e,t) = b(e) + p(e,t) + d(e,t) + g(e)</m:t>
+          </m:r>
+        </m:oMath>
+      </m:oMathPara>
+    </w:p>
+    <w:p>
       <w:r>
-        <w:t>Penalti sekolah, pasar, dan mal mengikuti panjang ruas yang terpapar zona pengaruh masing-masing 100 m, 150 m, dan 200 m. Tumpang tindih zona sejenis digabung agar tidak dihitung berulang. Penundaan perlintasan kereta hanya dikenakan pada perlintasan sebidang yang dikenali data; ruas bertingkat seperti jembatan dan terowongan tidak diberi penalti tersebut. Seluruh komponen biaya tidak negatif.</w:t>
+        <w:t>Penalti lokasi p(e,t) dihitung dari panjang paparan ruas terhadap sekolah, pasar, dan mal. Untuk tiap jenis k, xₖ(e) ialah panjang paparan dalam meter dan qₖ(t) ialah penalti detik per 100 m pada skenario t. Zona sejenis digabung agar paparan tidak dihitung berulang.</w:t>
       </w:r>
+    </w:p>
+    <w:p>
+      <w:pPr>
+        <w:keepLines/>
+        <w:spacing w:before="60" w:after="100"/>
+        <w:jc w:val="center"/>
+      </w:pPr>
+      <m:oMathPara>
+        <m:oMath>
+          <m:r>
+            <m:t>p(e,t) = ∑ₖ∈K [xₖ(e) / 100] qₖ(t)</m:t>
+          </m:r>
+        </m:oMath>
+      </m:oMathPara>
+    </w:p>
+    <w:p>
+      <w:pPr>
+        <w:keepLines/>
+        <w:spacing w:before="60" w:after="100"/>
+        <w:jc w:val="center"/>
+      </w:pPr>
+      <m:oMathPara>
+        <m:oMath>
+          <m:r>
+            <m:t>d(e,t) = Iₛ(e)qₛ(t) + Iᵣ(e)qᵣ(t)</m:t>
+          </m:r>
+        </m:oMath>
+      </m:oMathPara>
     </w:p>
     <w:p>
       <w:r>
@@ -873,7 +943,7 @@
     </w:tbl>
     <w:p>
       <w:r>
-        <w:t>Gerbang dengan akses yang diizinkan diberi asumsi tunggu 10 detik, kecuali gerbang Grafika yang telah dikonfirmasi dapat dilalui dan diasumsikan tanpa waktu tunggu. Gerbang yang tidak diketahui aksesnya atau ditandai privat dikeluarkan dari graf.</w:t>
+        <w:t>Pada persamaan biaya, Iₛ dan Iᵣ bernilai 1 hanya jika ruas memiliki lampu lalu lintas atau perlintasan kereta sebidang yang teridentifikasi; selain itu nilainya 0. Nilai qₛ dan qᵣ mengikuti Tabel I. Ruas bertingkat tidak dikenai penalti perlintasan. Komponen g bernilai 10 detik untuk gerbang dengan akses yang diizinkan, kecuali gerbang Grafika yang dikonfirmasi dapat dilalui dan diasumsikan 0 detik. Gerbang yang aksesnya tidak diketahui atau privat dikeluarkan dari graf.</w:t>
       </w:r>
     </w:p>
     <w:p>
@@ -940,12 +1010,107 @@
     </w:p>
     <w:p>
       <w:r>
-        <w:t>Keadaan pencarian dinyatakan sebagai pasangan (simpul saat ini, ID sisi masuk) karena legalitas belokan bergantung pada ruas sebelumnya. Kedua algoritma memakai antrean prioritas min-heap, biaya terbaik setiap keadaan, dan penunjuk induk untuk rekonstruksi rute. UCS mengurutkan keadaan menurut biaya kumulatif g, sedangkan A* memakai g + h. Pencarian dihentikan saat keadaan tujuan yang sah dikeluarkan dari antrean. Semua titik rumah sakit menjadi tujuan dalam satu pencarian.</w:t>
+        <w:t>Keadaan pencarian adalah pasangan simpul saat ini dan ID sisi masuk, sebagaimana dinyatakan pada model graf, karena legalitas belokan bergantung pada ruas sebelumnya. Pada keadaan awal, sisi masuk kosong. Misalkan 𝒫(o,r) adalah semua lintasan sah dari asal o ke titik jalan rumah sakit r. Sistem memilih pasangan tujuan dan lintasan dengan biaya total terkecil:</w:t>
       </w:r>
     </w:p>
     <w:p>
+      <w:pPr>
+        <w:keepLines/>
+        <w:spacing w:before="60" w:after="100"/>
+        <w:jc w:val="center"/>
+      </w:pPr>
+      <m:oMathPara>
+        <m:oMath>
+          <m:r>
+            <m:t>C(P,t) = ∑ₑ∈P c(e,t)</m:t>
+          </m:r>
+        </m:oMath>
+      </m:oMathPara>
+    </w:p>
+    <w:p>
+      <w:pPr>
+        <w:keepLines/>
+        <w:spacing w:before="60" w:after="100"/>
+        <w:jc w:val="center"/>
+      </w:pPr>
+      <m:oMathPara>
+        <m:oMath>
+          <m:r>
+            <m:t>J(o,t) = min { C(P,t) : r ∈ R, P ∈ 𝒫(o,r) }</m:t>
+          </m:r>
+        </m:oMath>
+      </m:oMathPara>
+    </w:p>
+    <w:p>
+      <w:pPr>
+        <w:keepLines/>
+        <w:spacing w:before="60" w:after="100"/>
+        <w:jc w:val="both"/>
+      </w:pPr>
       <w:r>
-        <w:t>Heuristik A* ialah jarak lurus UTM dari simpul saat ini ke tujuan rumah sakit terdekat, dibagi kecepatan maksimum model 60 km/jam atau sekitar 16,67 m/s. Panjang lintasan jalan tidak lebih pendek daripada jarak lurus, kecepatan model tidak melampaui batas tersebut, dan seluruh penalti tidak negatif. Karena itu, heuristik merupakan batas bawah biaya sisa pada graf [3]. Pembatasan arah dan belokan hanya mengurangi lintasan yang sah serta tidak merusak sifat batas bawah ini.</w:t>
+        <w:t>Pasangan rumah sakit dan lintasan yang mencapai nilai minimum ini menjadi hasil. UCS mengurutkan antrean menurut biaya kumulatif lintasan, sedangkan A* menambahkan heuristik ke biaya tersebut. Keduanya memakai heap minimum, menyimpan biaya terbaik dan induk keadaan, lalu berhenti saat keadaan tujuan sah dikeluarkan dari antrean.</w:t>
+      </w:r>
+    </w:p>
+    <w:p>
+      <w:pPr>
+        <w:keepLines/>
+        <w:spacing w:before="60" w:after="100"/>
+        <w:jc w:val="center"/>
+      </w:pPr>
+      <m:oMathPara>
+        <m:oMath>
+          <m:r>
+            <m:t>fUCS(s) = g(s),    fA*(s) = g(s) + h(v)</m:t>
+          </m:r>
+        </m:oMath>
+      </m:oMathPara>
+    </w:p>
+    <w:p>
+      <w:pPr>
+        <w:keepNext/>
+      </w:pPr>
+      <w:r>
+        <w:t>Heuristik A* menggunakan jarak lurus UTM ke titik tujuan rumah sakit terdekat, dibagi kecepatan maksimum model 60 km/jam atau sekitar 16,67 m/s:</w:t>
+      </w:r>
+    </w:p>
+    <w:p>
+      <w:pPr>
+        <w:keepNext/>
+        <w:keepLines/>
+        <w:spacing w:before="60" w:after="100"/>
+        <w:jc w:val="center"/>
+      </w:pPr>
+      <m:oMathPara>
+        <m:oMath>
+          <m:r>
+            <m:t>h(v) = min { d(v,r) : r ∈ R } / (60 / 3,6)</m:t>
+          </m:r>
+        </m:oMath>
+      </m:oMathPara>
+    </w:p>
+    <w:p>
+      <w:pPr>
+        <w:keepNext/>
+        <w:keepLines/>
+        <w:spacing w:before="60" w:after="100"/>
+        <w:jc w:val="center"/>
+      </w:pPr>
+      <m:oMathPara>
+        <m:oMath>
+          <m:r>
+            <m:t>h(v) ≤ J(v,t)</m:t>
+          </m:r>
+        </m:oMath>
+      </m:oMathPara>
+    </w:p>
+    <w:p>
+      <w:pPr>
+        <w:keepLines/>
+        <w:spacing w:before="60" w:after="100"/>
+        <w:jc w:val="both"/>
+      </w:pPr>
+      <w:r>
+        <w:t>Di sini J(v,t) ialah biaya sisa optimal dari simpul v untuk skenario t. Panjang lintasan jalan tidak lebih pendek daripada jarak lurus, kecepatan ruas tidak melampaui 60 km/jam, dan seluruh penalti tidak negatif. Karena itu, ketaksamaan di atas berlaku dan heuristik A* admisibel [3]. Pembatasan arah dan belokan hanya mengurangi lintasan sah dan tidak mengubah batas bawah tersebut.</w:t>
       </w:r>
     </w:p>
     <w:p>

</xml_diff>

<commit_message>
Clarify mathematical notation in IEEE report
</commit_message>
<xml_diff>
--- a/dokumen/Laporan_RuteSiaga_IEEE_Final.docx
+++ b/dokumen/Laporan_RuteSiaga_IEEE_Final.docx
@@ -163,7 +163,7 @@
       <m:oMathPara>
         <m:oMath>
           <m:r>
-            <m:t>c(e,t) = b(e) + p(e,t) + d(e,t) + g(e)</m:t>
+            <m:t>c(e,t) = b(e) + p(e,t) + w(e,t) + g(e)</m:t>
           </m:r>
         </m:oMath>
       </m:oMathPara>
@@ -196,7 +196,7 @@
       <m:oMathPara>
         <m:oMath>
           <m:r>
-            <m:t>d(e,t) = Iₛ(e)qₛ(t) + Iᵣ(e)qᵣ(t)</m:t>
+            <m:t>w(e,t) = Iₛ(e)qₛ(t) + Iᵣ(e)qᵣ(t)</m:t>
           </m:r>
         </m:oMath>
       </m:oMathPara>
@@ -943,7 +943,7 @@
     </w:tbl>
     <w:p>
       <w:r>
-        <w:t>Pada persamaan biaya, Iₛ dan Iᵣ bernilai 1 hanya jika ruas memiliki lampu lalu lintas atau perlintasan kereta sebidang yang teridentifikasi; selain itu nilainya 0. Nilai qₛ dan qᵣ mengikuti Tabel I. Ruas bertingkat tidak dikenai penalti perlintasan. Komponen g bernilai 10 detik untuk gerbang dengan akses yang diizinkan, kecuali gerbang Grafika yang dikonfirmasi dapat dilalui dan diasumsikan 0 detik. Gerbang yang aksesnya tidak diketahui atau privat dikeluarkan dari graf.</w:t>
+        <w:t>Waktu tunggu w(e,t) mencakup lampu lalu lintas dan perlintasan. Pada persamaan biaya, Iₛ dan Iᵣ bernilai 1 hanya jika ruas memiliki lampu lalu lintas atau perlintasan kereta sebidang yang teridentifikasi; selain itu nilainya 0. Nilai qₛ dan qᵣ mengikuti Tabel I. Ruas bertingkat tidak dikenai penalti perlintasan. Komponen g bernilai 10 detik untuk gerbang dengan akses yang diizinkan, kecuali gerbang Grafika yang dikonfirmasi dapat dilalui dan diasumsikan 0 detik. Gerbang yang aksesnya tidak diketahui atau privat dikeluarkan dari graf.</w:t>
       </w:r>
     </w:p>
     <w:p>

</xml_diff>